<commit_message>
Nhúng macro đại diện SCCN trực tiếp vào mẫu BBNT D-Office
Ba mẫu bbnt-do-template-bi/dau/loi.docx trước đây chỉ có dấu chấm lửng;
macro đại diện Phân xưởng Sửa chữa Cơ nhiệt được chèn động vào OOXML lúc
xuất file, nên mở mẫu gốc không thấy và khó bảo trì.

Dựng lại cả ba mẫu bằng Microsoft Word (giữ nguyên định dạng, không sửa
XML thô nên Word không còn đòi sửa chữa file), ghi sẵn:
- "Ông: {{sccnRepresentativeName}}" và "Chức vụ: {{sccnRepresentativePosition}}"
  ở phần thành phần tham gia
- {{sccnRepresentativeName}} vào ô ký tên cột Phân Xưởng Sửa Chữa Cơ Nhiệt

Nới điều kiện vá trong patchSccnRepresentativeTokens: đếm số token thay vì
kiểm tra sự tồn tại, để mẫu mới (đã có sẵn 2 token) không bị chèn thêm tên
vào ô ký khác, đồng thời mẫu cũ đang deploy trên server vẫn được vá đủ.

Đã render thử cả mẫu mới lẫn mẫu cũ với dữ liệu mẫu: kết quả trùng khớp,
tên nằm đúng cột ký, không sót macro.

Co-Authored-By: Claude Opus 5 <noreply@anthropic.com>
</commit_message>
<xml_diff>
--- a/templates/bbnt-do-template-bi.docx
+++ b/templates/bbnt-do-template-bi.docx
@@ -418,7 +418,7 @@
           <w:sz w:val="26"/>
           <w:szCs w:val="26"/>
         </w:rPr>
-        <w:t>Ông: ……………………………</w:t>
+        <w:t>Ông: {{sccnRepresentativeName}}</w:t>
       </w:r>
       <w:r>
         <w:tab/>
@@ -429,7 +429,7 @@
           <w:sz w:val="26"/>
           <w:szCs w:val="26"/>
         </w:rPr>
-        <w:t>Chức vụ: ……………………</w:t>
+        <w:t>Chức vụ: {{sccnRepresentativePosition}}</w:t>
       </w:r>
     </w:p>
     <w:p>
@@ -2421,7 +2421,7 @@
                 <w:sz w:val="26"/>
                 <w:szCs w:val="26"/>
               </w:rPr>
-              <w:t>Trống</w:t>
+              <w:t>{{sccnRepresentativeName}}</w:t>
             </w:r>
           </w:p>
         </w:tc>

</xml_diff>

<commit_message>
Cập nhật mẫu BBNT DO bi nghiền và dầu bôi trơn
Bản Word do người dùng chỉnh, bổ sung số phiếu công tác vào cả hai mẫu. Hai mẫu
này được lib/bbnt-do-doc.ts nạp thẳng từ thư mục templates của repo nên phải đi
kèm deploy (bi.docx dùng cho phần còn lại, dau.docx cho "Dầu bôi trơn").

Đối chiếu trước khi commit:
- zip hợp lệ, đọc được word/document.xml;
- KHÔNG mất token nào so với bản đang chạy (bi giữ 27, dau giữ 28);
- cả hai thêm {pctNumber} — token này code đã cấp sẵn (bbnt-do-doc.ts:200) nên
  sẽ điền được, không in ra chữ sống.

Hoàn tất bộ 3 mẫu BBNT DO: lõi lọc đã cập nhật ở 4040d12.

Co-Authored-By: Claude Opus 5 <noreply@anthropic.com>
</commit_message>
<xml_diff>
--- a/templates/bbnt-do-template-bi.docx
+++ b/templates/bbnt-do-template-bi.docx
@@ -270,7 +270,7 @@
           <w:sz w:val="26"/>
           <w:szCs w:val="26"/>
         </w:rPr>
-        <w:t>số: {{</w:t>
+        <w:t>số:{</w:t>
       </w:r>
       <w:proofErr w:type="gramEnd"/>
       <w:r>
@@ -279,7 +279,7 @@
           <w:sz w:val="26"/>
           <w:szCs w:val="26"/>
         </w:rPr>
-        <w:t>pctNumber}}</w:t>
+        <w:t>{pctNumber}}</w:t>
       </w:r>
     </w:p>
     <w:p>
@@ -987,6 +987,7 @@
           <w:sz w:val="26"/>
           <w:szCs w:val="26"/>
         </w:rPr>
+        <w:lastRenderedPageBreak/>
         <w:t>-</w:t>
       </w:r>
       <w:r>
@@ -1023,7 +1024,6 @@
           <w:sz w:val="26"/>
           <w:szCs w:val="26"/>
         </w:rPr>
-        <w:lastRenderedPageBreak/>
         <w:t>-</w:t>
       </w:r>
       <w:r>
@@ -1104,8 +1104,6 @@
               <w:rPr>
                 <w:rFonts w:ascii="Times New Roman" w:hAnsi="Times New Roman" w:cs="Times New Roman"/>
                 <w:b/>
-                <w:sz w:val="26"/>
-                <w:szCs w:val="26"/>
               </w:rPr>
               <w:t>Stt</w:t>
             </w:r>
@@ -1125,8 +1123,6 @@
               <w:rPr>
                 <w:rFonts w:ascii="Times New Roman" w:hAnsi="Times New Roman" w:cs="Times New Roman"/>
                 <w:b/>
-                <w:sz w:val="26"/>
-                <w:szCs w:val="26"/>
               </w:rPr>
               <w:t>Nội dung công tác</w:t>
             </w:r>
@@ -1146,8 +1142,6 @@
               <w:rPr>
                 <w:rFonts w:ascii="Times New Roman" w:hAnsi="Times New Roman" w:cs="Times New Roman"/>
                 <w:b/>
-                <w:sz w:val="26"/>
-                <w:szCs w:val="26"/>
               </w:rPr>
               <w:t>Kết quả</w:t>
             </w:r>
@@ -1167,8 +1161,6 @@
               <w:rPr>
                 <w:rFonts w:ascii="Times New Roman" w:hAnsi="Times New Roman" w:cs="Times New Roman"/>
                 <w:b/>
-                <w:sz w:val="26"/>
-                <w:szCs w:val="26"/>
               </w:rPr>
               <w:t>Vật tư thay thế</w:t>
             </w:r>
@@ -1188,8 +1180,6 @@
               <w:rPr>
                 <w:rFonts w:ascii="Times New Roman" w:hAnsi="Times New Roman" w:cs="Times New Roman"/>
                 <w:b/>
-                <w:sz w:val="26"/>
-                <w:szCs w:val="26"/>
               </w:rPr>
               <w:t>Ghi chú</w:t>
             </w:r>
@@ -1230,18 +1220,8 @@
             <w:r>
               <w:rPr>
                 <w:rFonts w:ascii="Times New Roman" w:hAnsi="Times New Roman" w:cs="Times New Roman"/>
-                <w:sz w:val="26"/>
-                <w:szCs w:val="26"/>
-              </w:rPr>
-              <w:t>-</w:t>
-            </w:r>
-            <w:r>
-              <w:rPr>
-                <w:rFonts w:ascii="Times New Roman" w:hAnsi="Times New Roman" w:cs="Times New Roman"/>
-                <w:sz w:val="26"/>
-                <w:szCs w:val="26"/>
-              </w:rPr>
-              <w:t>Cô lập thiết bị</w:t>
+              </w:rPr>
+              <w:t>-Cô lập thiết bị</w:t>
             </w:r>
           </w:p>
         </w:tc>
@@ -1258,8 +1238,6 @@
             <w:r>
               <w:rPr>
                 <w:rFonts w:ascii="Times New Roman" w:hAnsi="Times New Roman" w:cs="Times New Roman"/>
-                <w:sz w:val="26"/>
-                <w:szCs w:val="26"/>
               </w:rPr>
               <w:t>Đạt</w:t>
             </w:r>
@@ -1321,33 +1299,13 @@
               <w:spacing w:after="0" w:line="276" w:lineRule="auto"/>
               <w:rPr>
                 <w:rFonts w:ascii="Times New Roman" w:hAnsi="Times New Roman" w:cs="Times New Roman"/>
-                <w:sz w:val="26"/>
-                <w:szCs w:val="26"/>
-              </w:rPr>
-            </w:pPr>
-            <w:r>
-              <w:rPr>
-                <w:rFonts w:ascii="Times New Roman" w:hAnsi="Times New Roman" w:cs="Times New Roman"/>
-                <w:sz w:val="26"/>
-                <w:szCs w:val="26"/>
-              </w:rPr>
-              <w:t xml:space="preserve">- Ghi nhận thông số </w:t>
-            </w:r>
-            <w:r>
-              <w:rPr>
-                <w:rFonts w:ascii="Times New Roman" w:hAnsi="Times New Roman" w:cs="Times New Roman"/>
-                <w:sz w:val="26"/>
-                <w:szCs w:val="26"/>
-              </w:rPr>
-              <w:t>vận hành</w:t>
-            </w:r>
-            <w:r>
-              <w:rPr>
-                <w:rFonts w:ascii="Times New Roman" w:hAnsi="Times New Roman" w:cs="Times New Roman"/>
-                <w:sz w:val="26"/>
-                <w:szCs w:val="26"/>
-              </w:rPr>
-              <w:t xml:space="preserve"> máy nghiền trước khi châm bi</w:t>
+              </w:rPr>
+            </w:pPr>
+            <w:r>
+              <w:rPr>
+                <w:rFonts w:ascii="Times New Roman" w:hAnsi="Times New Roman" w:cs="Times New Roman"/>
+              </w:rPr>
+              <w:t>- Ghi nhận thông số vận hành máy nghiền trước khi châm bi</w:t>
             </w:r>
           </w:p>
         </w:tc>
@@ -1364,8 +1322,6 @@
             <w:r>
               <w:rPr>
                 <w:rFonts w:ascii="Times New Roman" w:hAnsi="Times New Roman" w:cs="Times New Roman"/>
-                <w:sz w:val="26"/>
-                <w:szCs w:val="26"/>
               </w:rPr>
               <w:t>Đạt</w:t>
             </w:r>
@@ -1427,15 +1383,11 @@
               <w:spacing w:after="0" w:line="276" w:lineRule="auto"/>
               <w:rPr>
                 <w:rFonts w:ascii="Times New Roman" w:hAnsi="Times New Roman" w:cs="Times New Roman"/>
-                <w:sz w:val="26"/>
-                <w:szCs w:val="26"/>
-              </w:rPr>
-            </w:pPr>
-            <w:r>
-              <w:rPr>
-                <w:rFonts w:ascii="Times New Roman" w:hAnsi="Times New Roman" w:cs="Times New Roman"/>
-                <w:sz w:val="26"/>
-                <w:szCs w:val="26"/>
+              </w:rPr>
+            </w:pPr>
+            <w:r>
+              <w:rPr>
+                <w:rFonts w:ascii="Times New Roman" w:hAnsi="Times New Roman" w:cs="Times New Roman"/>
               </w:rPr>
               <w:t xml:space="preserve"> - Châm bi</w:t>
             </w:r>
@@ -1454,8 +1406,6 @@
             <w:r>
               <w:rPr>
                 <w:rFonts w:ascii="Times New Roman" w:hAnsi="Times New Roman" w:cs="Times New Roman"/>
-                <w:sz w:val="26"/>
-                <w:szCs w:val="26"/>
               </w:rPr>
               <w:t>Đạt</w:t>
             </w:r>
@@ -1474,8 +1424,6 @@
             <w:r>
               <w:rPr>
                 <w:rFonts w:ascii="Times New Roman" w:hAnsi="Times New Roman" w:cs="Times New Roman"/>
-                <w:sz w:val="26"/>
-                <w:szCs w:val="26"/>
               </w:rPr>
               <w:t>{{materialSummary}}</w:t>
             </w:r>
@@ -1538,23 +1486,17 @@
               <w:spacing w:after="0" w:line="276" w:lineRule="auto"/>
               <w:rPr>
                 <w:rFonts w:ascii="Times New Roman" w:hAnsi="Times New Roman" w:cs="Times New Roman"/>
-                <w:sz w:val="26"/>
-                <w:szCs w:val="26"/>
-              </w:rPr>
-            </w:pPr>
-            <w:r>
-              <w:rPr>
-                <w:rFonts w:ascii="Times New Roman" w:hAnsi="Times New Roman" w:cs="Times New Roman"/>
-                <w:sz w:val="26"/>
-                <w:szCs w:val="26"/>
+              </w:rPr>
+            </w:pPr>
+            <w:r>
+              <w:rPr>
+                <w:rFonts w:ascii="Times New Roman" w:hAnsi="Times New Roman" w:cs="Times New Roman"/>
               </w:rPr>
               <w:t xml:space="preserve">- Ghi nhận thông số vận hành </w:t>
             </w:r>
             <w:r>
               <w:rPr>
                 <w:rFonts w:ascii="Times New Roman" w:hAnsi="Times New Roman" w:cs="Times New Roman"/>
-                <w:sz w:val="26"/>
-                <w:szCs w:val="26"/>
               </w:rPr>
               <w:br/>
               <w:t>máy nghiền sau khi châm bi</w:t>
@@ -1574,8 +1516,6 @@
             <w:r>
               <w:rPr>
                 <w:rFonts w:ascii="Times New Roman" w:hAnsi="Times New Roman" w:cs="Times New Roman"/>
-                <w:sz w:val="26"/>
-                <w:szCs w:val="26"/>
               </w:rPr>
               <w:t>Đạt</w:t>
             </w:r>
@@ -1639,8 +1579,6 @@
             <w:r>
               <w:rPr>
                 <w:rFonts w:ascii="Times New Roman" w:hAnsi="Times New Roman" w:cs="Times New Roman"/>
-                <w:sz w:val="26"/>
-                <w:szCs w:val="26"/>
               </w:rPr>
               <w:t>-Thu dọn dụng cụ, vật tư, vệ sinh sạch sẽ vị trí công tác.</w:t>
             </w:r>
@@ -1659,8 +1597,6 @@
             <w:r>
               <w:rPr>
                 <w:rFonts w:ascii="Times New Roman" w:hAnsi="Times New Roman" w:cs="Times New Roman"/>
-                <w:sz w:val="26"/>
-                <w:szCs w:val="26"/>
               </w:rPr>
               <w:t>Đạt</w:t>
             </w:r>
@@ -1724,8 +1660,6 @@
             <w:r>
               <w:rPr>
                 <w:rFonts w:ascii="Times New Roman" w:hAnsi="Times New Roman" w:cs="Times New Roman"/>
-                <w:sz w:val="26"/>
-                <w:szCs w:val="26"/>
               </w:rPr>
               <w:t>-Tái lập thiết bị, vận hành kiểm tra.</w:t>
             </w:r>
@@ -1744,8 +1678,6 @@
             <w:r>
               <w:rPr>
                 <w:rFonts w:ascii="Times New Roman" w:hAnsi="Times New Roman" w:cs="Times New Roman"/>
-                <w:sz w:val="26"/>
-                <w:szCs w:val="26"/>
               </w:rPr>
               <w:t>Đạt</w:t>
             </w:r>
@@ -1922,12 +1854,6 @@
         </w:rPr>
         <w:t>Phân xưởng Vận hành 1 tiếp quản hệ thống/thiết bị kể trên kể từ {{workEndedAt}}./.</w:t>
       </w:r>
-    </w:p>
-    <w:p>
-      <w:pPr>
-        <w:spacing w:after="60" w:line="276" w:lineRule="auto"/>
-        <w:ind w:left="567"/>
-      </w:pPr>
     </w:p>
     <w:tbl>
       <w:tblPr>
@@ -2470,7 +2396,7 @@
           <w:sz w:val="22"/>
           <w:szCs w:val="22"/>
         </w:rPr>
-        <w:t>- Lưu: VH1, KH&amp;VT;</w:t>
+        <w:t>- Lưu: VH1, KHVT;</w:t>
       </w:r>
     </w:p>
     <w:p>
@@ -3806,6 +3732,7 @@
   <w:style w:type="character" w:default="1" w:styleId="DefaultParagraphFont">
     <w:name w:val="Default Paragraph Font"/>
     <w:uiPriority w:val="1"/>
+    <w:semiHidden/>
     <w:unhideWhenUsed/>
   </w:style>
   <w:style w:type="table" w:default="1" w:styleId="TableNormal">

</xml_diff>

<commit_message>
chore(vật tư): cập nhật mẫu Word BBNT đã chốt
Chỉnh trình bày ba mẫu: BBNT D-Office của bi nghiền và của dầu bôi trơn,
BBNT ký tay của bi nghiền. Bộ token giữ nguyên hoàn toàn (28/29/13 token,
không thêm không bớt) nên phần điền dữ liệu không đổi.

Co-Authored-By: Claude Opus 5 <noreply@anthropic.com>
</commit_message>
<xml_diff>
--- a/templates/bbnt-do-template-bi.docx
+++ b/templates/bbnt-do-template-bi.docx
@@ -1,6 +1,6 @@
 
 <file path=word/document.xml><?xml version="1.0" encoding="utf-8"?>
-<w:document xmlns:wpc="http://schemas.microsoft.com/office/word/2010/wordprocessingCanvas" xmlns:cx="http://schemas.microsoft.com/office/drawing/2014/chartex" xmlns:cx1="http://schemas.microsoft.com/office/drawing/2015/9/8/chartex" xmlns:cx2="http://schemas.microsoft.com/office/drawing/2015/10/21/chartex" xmlns:cx3="http://schemas.microsoft.com/office/drawing/2016/5/9/chartex" xmlns:cx4="http://schemas.microsoft.com/office/drawing/2016/5/10/chartex" xmlns:cx5="http://schemas.microsoft.com/office/drawing/2016/5/11/chartex" xmlns:cx6="http://schemas.microsoft.com/office/drawing/2016/5/12/chartex" xmlns:cx7="http://schemas.microsoft.com/office/drawing/2016/5/13/chartex" xmlns:cx8="http://schemas.microsoft.com/office/drawing/2016/5/14/chartex" xmlns:mc="http://schemas.openxmlformats.org/markup-compatibility/2006" xmlns:aink="http://schemas.microsoft.com/office/drawing/2016/ink" xmlns:am3d="http://schemas.microsoft.com/office/drawing/2017/model3d" xmlns:o="urn:schemas-microsoft-com:office:office" xmlns:oel="http://schemas.microsoft.com/office/2019/extlst" xmlns:r="http://schemas.openxmlformats.org/officeDocument/2006/relationships" xmlns:m="http://schemas.openxmlformats.org/officeDocument/2006/math" xmlns:v="urn:schemas-microsoft-com:vml" xmlns:wp14="http://schemas.microsoft.com/office/word/2010/wordprocessingDrawing" xmlns:wp="http://schemas.openxmlformats.org/drawingml/2006/wordprocessingDrawing" xmlns:w10="urn:schemas-microsoft-com:office:word" xmlns:w="http://schemas.openxmlformats.org/wordprocessingml/2006/main" xmlns:w14="http://schemas.microsoft.com/office/word/2010/wordml" xmlns:w15="http://schemas.microsoft.com/office/word/2012/wordml" xmlns:w16cex="http://schemas.microsoft.com/office/word/2018/wordml/cex" xmlns:w16cid="http://schemas.microsoft.com/office/word/2016/wordml/cid" xmlns:w16="http://schemas.microsoft.com/office/word/2018/wordml" xmlns:w16du="http://schemas.microsoft.com/office/word/2023/wordml/word16du" xmlns:w16sdtdh="http://schemas.microsoft.com/office/word/2020/wordml/sdtdatahash" xmlns:w16sdtfl="http://schemas.microsoft.com/office/word/2024/wordml/sdtformatlock" xmlns:w16se="http://schemas.microsoft.com/office/word/2015/wordml/symex" xmlns:wpg="http://schemas.microsoft.com/office/word/2010/wordprocessingGroup" xmlns:wpi="http://schemas.microsoft.com/office/word/2010/wordprocessingInk" xmlns:wne="http://schemas.microsoft.com/office/word/2006/wordml" xmlns:wps="http://schemas.microsoft.com/office/word/2010/wordprocessingShape" mc:Ignorable="w14 w15 w16se w16cid w16 w16cex w16sdtdh w16sdtfl w16du wp14">
+<w:document xmlns:wpc="http://schemas.microsoft.com/office/word/2010/wordprocessingCanvas" xmlns:cx="http://schemas.microsoft.com/office/drawing/2014/chartex" xmlns:cx1="http://schemas.microsoft.com/office/drawing/2015/9/8/chartex" xmlns:cx2="http://schemas.microsoft.com/office/drawing/2015/10/21/chartex" xmlns:cx3="http://schemas.microsoft.com/office/drawing/2016/5/9/chartex" xmlns:cx4="http://schemas.microsoft.com/office/drawing/2016/5/10/chartex" xmlns:cx5="http://schemas.microsoft.com/office/drawing/2016/5/11/chartex" xmlns:cx6="http://schemas.microsoft.com/office/drawing/2016/5/12/chartex" xmlns:cx7="http://schemas.microsoft.com/office/drawing/2016/5/13/chartex" xmlns:cx8="http://schemas.microsoft.com/office/drawing/2016/5/14/chartex" xmlns:mc="http://schemas.openxmlformats.org/markup-compatibility/2006" xmlns:aink="http://schemas.microsoft.com/office/drawing/2016/ink" xmlns:am3d="http://schemas.microsoft.com/office/drawing/2017/model3d" xmlns:o="urn:schemas-microsoft-com:office:office" xmlns:oel="http://schemas.microsoft.com/office/2019/extlst" xmlns:r="http://schemas.openxmlformats.org/officeDocument/2006/relationships" xmlns:m="http://schemas.openxmlformats.org/officeDocument/2006/math" xmlns:v="urn:schemas-microsoft-com:vml" xmlns:wp14="http://schemas.microsoft.com/office/word/2010/wordprocessingDrawing" xmlns:wp="http://schemas.openxmlformats.org/drawingml/2006/wordprocessingDrawing" xmlns:w10="urn:schemas-microsoft-com:office:word" xmlns:w="http://schemas.openxmlformats.org/wordprocessingml/2006/main" xmlns:w14="http://schemas.microsoft.com/office/word/2010/wordml" xmlns:w15="http://schemas.microsoft.com/office/word/2012/wordml" xmlns:w16cei="http://schemas.microsoft.com/office/word/2026/wordml/cei" xmlns:w16cex="http://schemas.microsoft.com/office/word/2018/wordml/cex" xmlns:w16cid="http://schemas.microsoft.com/office/word/2016/wordml/cid" xmlns:w16="http://schemas.microsoft.com/office/word/2018/wordml" xmlns:w16du="http://schemas.microsoft.com/office/word/2023/wordml/word16du" xmlns:w16sdtdh="http://schemas.microsoft.com/office/word/2020/wordml/sdtdatahash" xmlns:w16sdtfl="http://schemas.microsoft.com/office/word/2024/wordml/sdtformatlock" xmlns:w16se="http://schemas.microsoft.com/office/word/2015/wordml/symex" xmlns:wpg="http://schemas.microsoft.com/office/word/2010/wordprocessingGroup" xmlns:wpi="http://schemas.microsoft.com/office/word/2010/wordprocessingInk" xmlns:wne="http://schemas.microsoft.com/office/word/2006/wordml" xmlns:wps="http://schemas.microsoft.com/office/word/2010/wordprocessingShape" mc:Ignorable="w14 w15 w16se w16cid w16 w16cex w16sdtdh w16sdtfl w16du wp14">
   <w:body>
     <w:tbl>
       <w:tblPr>
@@ -1221,7 +1221,13 @@
               <w:rPr>
                 <w:rFonts w:ascii="Times New Roman" w:hAnsi="Times New Roman" w:cs="Times New Roman"/>
               </w:rPr>
-              <w:t>-Cô lập thiết bị</w:t>
+              <w:t>-</w:t>
+            </w:r>
+            <w:r>
+              <w:rPr>
+                <w:rFonts w:ascii="Times New Roman" w:hAnsi="Times New Roman" w:cs="Times New Roman"/>
+              </w:rPr>
+              <w:t>Vận chuyển bi đến vị trí công tác</w:t>
             </w:r>
           </w:p>
         </w:tc>
@@ -3091,7 +3097,7 @@
 </file>
 
 <file path=word/numbering.xml><?xml version="1.0" encoding="utf-8"?>
-<w:numbering xmlns:wpc="http://schemas.microsoft.com/office/word/2010/wordprocessingCanvas" xmlns:cx="http://schemas.microsoft.com/office/drawing/2014/chartex" xmlns:cx1="http://schemas.microsoft.com/office/drawing/2015/9/8/chartex" xmlns:cx2="http://schemas.microsoft.com/office/drawing/2015/10/21/chartex" xmlns:cx3="http://schemas.microsoft.com/office/drawing/2016/5/9/chartex" xmlns:cx4="http://schemas.microsoft.com/office/drawing/2016/5/10/chartex" xmlns:cx5="http://schemas.microsoft.com/office/drawing/2016/5/11/chartex" xmlns:cx6="http://schemas.microsoft.com/office/drawing/2016/5/12/chartex" xmlns:cx7="http://schemas.microsoft.com/office/drawing/2016/5/13/chartex" xmlns:cx8="http://schemas.microsoft.com/office/drawing/2016/5/14/chartex" xmlns:mc="http://schemas.openxmlformats.org/markup-compatibility/2006" xmlns:aink="http://schemas.microsoft.com/office/drawing/2016/ink" xmlns:am3d="http://schemas.microsoft.com/office/drawing/2017/model3d" xmlns:o="urn:schemas-microsoft-com:office:office" xmlns:oel="http://schemas.microsoft.com/office/2019/extlst" xmlns:r="http://schemas.openxmlformats.org/officeDocument/2006/relationships" xmlns:m="http://schemas.openxmlformats.org/officeDocument/2006/math" xmlns:v="urn:schemas-microsoft-com:vml" xmlns:wp14="http://schemas.microsoft.com/office/word/2010/wordprocessingDrawing" xmlns:wp="http://schemas.openxmlformats.org/drawingml/2006/wordprocessingDrawing" xmlns:w10="urn:schemas-microsoft-com:office:word" xmlns:w="http://schemas.openxmlformats.org/wordprocessingml/2006/main" xmlns:w14="http://schemas.microsoft.com/office/word/2010/wordml" xmlns:w15="http://schemas.microsoft.com/office/word/2012/wordml" xmlns:w16cex="http://schemas.microsoft.com/office/word/2018/wordml/cex" xmlns:w16cid="http://schemas.microsoft.com/office/word/2016/wordml/cid" xmlns:w16="http://schemas.microsoft.com/office/word/2018/wordml" xmlns:w16du="http://schemas.microsoft.com/office/word/2023/wordml/word16du" xmlns:w16sdtdh="http://schemas.microsoft.com/office/word/2020/wordml/sdtdatahash" xmlns:w16sdtfl="http://schemas.microsoft.com/office/word/2024/wordml/sdtformatlock" xmlns:w16se="http://schemas.microsoft.com/office/word/2015/wordml/symex" xmlns:wpg="http://schemas.microsoft.com/office/word/2010/wordprocessingGroup" xmlns:wpi="http://schemas.microsoft.com/office/word/2010/wordprocessingInk" xmlns:wne="http://schemas.microsoft.com/office/word/2006/wordml" xmlns:wps="http://schemas.microsoft.com/office/word/2010/wordprocessingShape" mc:Ignorable="w14 w15 w16se w16cid w16 w16cex w16sdtdh w16sdtfl w16du wp14">
+<w:numbering xmlns:wpc="http://schemas.microsoft.com/office/word/2010/wordprocessingCanvas" xmlns:cx="http://schemas.microsoft.com/office/drawing/2014/chartex" xmlns:cx1="http://schemas.microsoft.com/office/drawing/2015/9/8/chartex" xmlns:cx2="http://schemas.microsoft.com/office/drawing/2015/10/21/chartex" xmlns:cx3="http://schemas.microsoft.com/office/drawing/2016/5/9/chartex" xmlns:cx4="http://schemas.microsoft.com/office/drawing/2016/5/10/chartex" xmlns:cx5="http://schemas.microsoft.com/office/drawing/2016/5/11/chartex" xmlns:cx6="http://schemas.microsoft.com/office/drawing/2016/5/12/chartex" xmlns:cx7="http://schemas.microsoft.com/office/drawing/2016/5/13/chartex" xmlns:cx8="http://schemas.microsoft.com/office/drawing/2016/5/14/chartex" xmlns:mc="http://schemas.openxmlformats.org/markup-compatibility/2006" xmlns:aink="http://schemas.microsoft.com/office/drawing/2016/ink" xmlns:am3d="http://schemas.microsoft.com/office/drawing/2017/model3d" xmlns:o="urn:schemas-microsoft-com:office:office" xmlns:oel="http://schemas.microsoft.com/office/2019/extlst" xmlns:r="http://schemas.openxmlformats.org/officeDocument/2006/relationships" xmlns:m="http://schemas.openxmlformats.org/officeDocument/2006/math" xmlns:v="urn:schemas-microsoft-com:vml" xmlns:wp14="http://schemas.microsoft.com/office/word/2010/wordprocessingDrawing" xmlns:wp="http://schemas.openxmlformats.org/drawingml/2006/wordprocessingDrawing" xmlns:w10="urn:schemas-microsoft-com:office:word" xmlns:w="http://schemas.openxmlformats.org/wordprocessingml/2006/main" xmlns:w14="http://schemas.microsoft.com/office/word/2010/wordml" xmlns:w15="http://schemas.microsoft.com/office/word/2012/wordml" xmlns:w16cei="http://schemas.microsoft.com/office/word/2026/wordml/cei" xmlns:w16cex="http://schemas.microsoft.com/office/word/2018/wordml/cex" xmlns:w16cid="http://schemas.microsoft.com/office/word/2016/wordml/cid" xmlns:w16="http://schemas.microsoft.com/office/word/2018/wordml" xmlns:w16du="http://schemas.microsoft.com/office/word/2023/wordml/word16du" xmlns:w16sdtdh="http://schemas.microsoft.com/office/word/2020/wordml/sdtdatahash" xmlns:w16sdtfl="http://schemas.microsoft.com/office/word/2024/wordml/sdtformatlock" xmlns:w16se="http://schemas.microsoft.com/office/word/2015/wordml/symex" xmlns:wpg="http://schemas.microsoft.com/office/word/2010/wordprocessingGroup" xmlns:wpi="http://schemas.microsoft.com/office/word/2010/wordprocessingInk" xmlns:wne="http://schemas.microsoft.com/office/word/2006/wordml" xmlns:wps="http://schemas.microsoft.com/office/word/2010/wordprocessingShape" mc:Ignorable="w14 w15 w16se w16cid w16 w16cex w16sdtdh w16sdtfl w16du wp14">
   <w:abstractNum w:abstractNumId="0" w15:restartNumberingAfterBreak="0">
     <w:nsid w:val="61C91A5B"/>
     <w:multiLevelType w:val="hybridMultilevel"/>

</xml_diff>

<commit_message>
fix(bbnt-do): điền nội dung PCT/LCT vào biên bản nghiệm thu D-Office
Nội dung PCT nhập ở bước nghiệm thu không tới được biên bản: buildBbntDoDocument
chỉ đọc t.pctContent đã lưu, còn lời gọi lúc xuất BBNT DO không truyền giá trị vừa
nhập. Thêm override `pctContent` và ghép nhãn "Nội dung PCT/LCT:" cho cả hai mẫu —
mẫu có tag {{pctContent}} lẫn mẫu cũ chỉ có {{pctNumber}}.

Ba mẫu .docx cập nhật kèm.

Co-Authored-By: Claude Opus 5 <noreply@anthropic.com>
</commit_message>
<xml_diff>
--- a/templates/bbnt-do-template-bi.docx
+++ b/templates/bbnt-do-template-bi.docx
@@ -389,6 +389,14 @@
           <w:szCs w:val="28"/>
         </w:rPr>
         <w:t>pctNumber}}</w:t>
+      </w:r>
+      <w:r>
+        <w:rPr>
+          <w:rFonts w:ascii="Times New Roman" w:hAnsi="Times New Roman" w:cs="Times New Roman"/>
+          <w:sz w:val="28"/>
+          <w:szCs w:val="28"/>
+        </w:rPr>
+        <w:t xml:space="preserve">{{pctContent}}</w:t>
       </w:r>
     </w:p>
     <w:p>

</xml_diff>

<commit_message>
chore(bbnt-do): sửa ô ngày trống trong 3 mẫu Word BBNT D-Office
Thay các ô trống dạng "… / … / …" bằng "……" ở phần căn cứ (Biên bản
kiểm tra, Công văn, Phiếu đề xuất/giao hàng, BBNT vật tư trước khi
dùng) và dòng "Ngày thay/bổ sung gần nhất" của mẫu dầu.

Chỉ đổi chữ, không đụng thẻ điền dữ liệu: đã đối chiếu 42 thẻ
{{...}} của cả 3 mẫu bi/dau/loi, không mất và không thêm thẻ nào.

Co-Authored-By: Claude Opus 5 <noreply@anthropic.com>
</commit_message>
<xml_diff>
--- a/templates/bbnt-do-template-bi.docx
+++ b/templates/bbnt-do-template-bi.docx
@@ -370,15 +370,33 @@
           <w:sz w:val="28"/>
           <w:szCs w:val="28"/>
         </w:rPr>
-        <w:t>{{pctNumber}}</w:t>
-      </w:r>
-      <w:r>
-        <w:rPr>
-          <w:rFonts w:ascii="Times New Roman" w:hAnsi="Times New Roman" w:cs="Times New Roman"/>
-          <w:sz w:val="28"/>
-          <w:szCs w:val="28"/>
-        </w:rPr>
-        <w:t>{{pctContent}}</w:t>
+        <w:t>{{pctNumber</w:t>
+      </w:r>
+      <w:proofErr w:type="gramStart"/>
+      <w:r>
+        <w:rPr>
+          <w:rFonts w:ascii="Times New Roman" w:hAnsi="Times New Roman" w:cs="Times New Roman"/>
+          <w:sz w:val="28"/>
+          <w:szCs w:val="28"/>
+        </w:rPr>
+        <w:t>}}</w:t>
+      </w:r>
+      <w:r>
+        <w:rPr>
+          <w:rFonts w:ascii="Times New Roman" w:hAnsi="Times New Roman" w:cs="Times New Roman"/>
+          <w:sz w:val="28"/>
+          <w:szCs w:val="28"/>
+        </w:rPr>
+        <w:t>{</w:t>
+      </w:r>
+      <w:proofErr w:type="gramEnd"/>
+      <w:r>
+        <w:rPr>
+          <w:rFonts w:ascii="Times New Roman" w:hAnsi="Times New Roman" w:cs="Times New Roman"/>
+          <w:sz w:val="28"/>
+          <w:szCs w:val="28"/>
+        </w:rPr>
+        <w:t>{pctContent}}</w:t>
       </w:r>
     </w:p>
     <w:p>
@@ -441,6 +459,7 @@
         </w:rPr>
         <w:t xml:space="preserve">Đại diện phòng Kỹ thuật và </w:t>
       </w:r>
+      <w:proofErr w:type="gramStart"/>
       <w:r>
         <w:rPr>
           <w:rFonts w:ascii="Times New Roman" w:hAnsi="Times New Roman" w:cs="Times New Roman"/>
@@ -459,7 +478,18 @@
           <w:sz w:val="28"/>
           <w:szCs w:val="28"/>
         </w:rPr>
-        <w:t>n toàn</w:t>
+        <w:t>n</w:t>
+      </w:r>
+      <w:proofErr w:type="gramEnd"/>
+      <w:r>
+        <w:rPr>
+          <w:rFonts w:ascii="Times New Roman" w:hAnsi="Times New Roman" w:cs="Times New Roman"/>
+          <w:b/>
+          <w:iCs/>
+          <w:sz w:val="28"/>
+          <w:szCs w:val="28"/>
+        </w:rPr>
+        <w:t xml:space="preserve"> toàn</w:t>
       </w:r>
     </w:p>
     <w:p>
@@ -1060,7 +1090,23 @@
           <w:sz w:val="28"/>
           <w:szCs w:val="28"/>
         </w:rPr>
-        <w:t xml:space="preserve"> ngày ... / ... / ...; (không)</w:t>
+        <w:t xml:space="preserve"> ngà</w:t>
+      </w:r>
+      <w:r>
+        <w:rPr>
+          <w:rFonts w:ascii="Times New Roman" w:hAnsi="Times New Roman" w:cs="Times New Roman"/>
+          <w:sz w:val="28"/>
+          <w:szCs w:val="28"/>
+        </w:rPr>
+        <w:t>y: ….</w:t>
+      </w:r>
+      <w:r>
+        <w:rPr>
+          <w:rFonts w:ascii="Times New Roman" w:hAnsi="Times New Roman" w:cs="Times New Roman"/>
+          <w:sz w:val="28"/>
+          <w:szCs w:val="28"/>
+        </w:rPr>
+        <w:t>; (không)</w:t>
       </w:r>
     </w:p>
     <w:p>
@@ -1116,7 +1162,99 @@
           <w:sz w:val="28"/>
           <w:szCs w:val="28"/>
         </w:rPr>
-        <w:t>Công văn số …/..... ngày … / … / … của Phòng Kỹ thuật và An toàn về việc …(không);</w:t>
+        <w:t>Công văn s</w:t>
+      </w:r>
+      <w:r>
+        <w:rPr>
+          <w:rFonts w:ascii="Times New Roman" w:hAnsi="Times New Roman" w:cs="Times New Roman"/>
+          <w:sz w:val="28"/>
+          <w:szCs w:val="28"/>
+        </w:rPr>
+        <w:t xml:space="preserve">ố: </w:t>
+      </w:r>
+      <w:proofErr w:type="gramStart"/>
+      <w:r>
+        <w:rPr>
+          <w:rFonts w:ascii="Times New Roman" w:hAnsi="Times New Roman" w:cs="Times New Roman"/>
+          <w:sz w:val="28"/>
+          <w:szCs w:val="28"/>
+        </w:rPr>
+        <w:t>…..</w:t>
+      </w:r>
+      <w:proofErr w:type="gramEnd"/>
+      <w:r>
+        <w:rPr>
+          <w:rFonts w:ascii="Times New Roman" w:hAnsi="Times New Roman" w:cs="Times New Roman"/>
+          <w:sz w:val="28"/>
+          <w:szCs w:val="28"/>
+        </w:rPr>
+        <w:t>ngày</w:t>
+      </w:r>
+      <w:r>
+        <w:rPr>
+          <w:rFonts w:ascii="Times New Roman" w:hAnsi="Times New Roman" w:cs="Times New Roman"/>
+          <w:sz w:val="28"/>
+          <w:szCs w:val="28"/>
+        </w:rPr>
+        <w:t>:</w:t>
+      </w:r>
+      <w:r>
+        <w:rPr>
+          <w:rFonts w:ascii="Times New Roman" w:hAnsi="Times New Roman" w:cs="Times New Roman"/>
+          <w:sz w:val="28"/>
+          <w:szCs w:val="28"/>
+        </w:rPr>
+        <w:t xml:space="preserve"> </w:t>
+      </w:r>
+      <w:r>
+        <w:rPr>
+          <w:rFonts w:ascii="Times New Roman" w:hAnsi="Times New Roman" w:cs="Times New Roman"/>
+          <w:sz w:val="28"/>
+          <w:szCs w:val="28"/>
+        </w:rPr>
+        <w:t>……….</w:t>
+      </w:r>
+      <w:r>
+        <w:rPr>
+          <w:rFonts w:ascii="Times New Roman" w:hAnsi="Times New Roman" w:cs="Times New Roman"/>
+          <w:sz w:val="28"/>
+          <w:szCs w:val="28"/>
+        </w:rPr>
+        <w:t xml:space="preserve"> của Phòng Kỹ thuật và </w:t>
+      </w:r>
+      <w:proofErr w:type="gramStart"/>
+      <w:r>
+        <w:rPr>
+          <w:rFonts w:ascii="Times New Roman" w:hAnsi="Times New Roman" w:cs="Times New Roman"/>
+          <w:sz w:val="28"/>
+          <w:szCs w:val="28"/>
+        </w:rPr>
+        <w:t>An</w:t>
+      </w:r>
+      <w:proofErr w:type="gramEnd"/>
+      <w:r>
+        <w:rPr>
+          <w:rFonts w:ascii="Times New Roman" w:hAnsi="Times New Roman" w:cs="Times New Roman"/>
+          <w:sz w:val="28"/>
+          <w:szCs w:val="28"/>
+        </w:rPr>
+        <w:t xml:space="preserve"> toàn về việc …</w:t>
+      </w:r>
+      <w:r>
+        <w:rPr>
+          <w:rFonts w:ascii="Times New Roman" w:hAnsi="Times New Roman" w:cs="Times New Roman"/>
+          <w:sz w:val="28"/>
+          <w:szCs w:val="28"/>
+        </w:rPr>
+        <w:t xml:space="preserve">… </w:t>
+      </w:r>
+      <w:r>
+        <w:rPr>
+          <w:rFonts w:ascii="Times New Roman" w:hAnsi="Times New Roman" w:cs="Times New Roman"/>
+          <w:sz w:val="28"/>
+          <w:szCs w:val="28"/>
+        </w:rPr>
+        <w:t>(không);</w:t>
       </w:r>
     </w:p>
     <w:p>
@@ -1167,27 +1305,43 @@
       <w:r>
         <w:rPr>
           <w:rFonts w:ascii="Times New Roman" w:hAnsi="Times New Roman" w:cs="Times New Roman"/>
+          <w:sz w:val="28"/>
+          <w:szCs w:val="28"/>
+        </w:rPr>
+        <w:t xml:space="preserve">……. </w:t>
+      </w:r>
+      <w:r>
+        <w:rPr>
+          <w:rFonts w:ascii="Times New Roman" w:hAnsi="Times New Roman" w:cs="Times New Roman"/>
+          <w:sz w:val="28"/>
+          <w:szCs w:val="28"/>
+        </w:rPr>
+        <w:t>Phiếu giao hàng số {{deliveryNote}}</w:t>
+      </w:r>
+      <w:r>
+        <w:rPr>
+          <w:rFonts w:ascii="Times New Roman" w:hAnsi="Times New Roman" w:cs="Times New Roman"/>
+          <w:sz w:val="26"/>
+          <w:szCs w:val="26"/>
+        </w:rPr>
+        <w:t xml:space="preserve"> </w:t>
+      </w:r>
+      <w:r>
+        <w:rPr>
+          <w:rFonts w:ascii="Times New Roman" w:hAnsi="Times New Roman" w:cs="Times New Roman"/>
+          <w:sz w:val="28"/>
+          <w:szCs w:val="28"/>
+        </w:rPr>
+        <w:t>ngày</w:t>
+      </w:r>
+      <w:r>
+        <w:rPr>
+          <w:rFonts w:ascii="Times New Roman" w:hAnsi="Times New Roman" w:cs="Times New Roman"/>
           <w:b/>
           <w:bCs/>
           <w:sz w:val="28"/>
           <w:szCs w:val="28"/>
         </w:rPr>
-        <w:t>… / … / ….</w:t>
-      </w:r>
-      <w:r>
-        <w:rPr>
-          <w:rFonts w:ascii="Times New Roman" w:hAnsi="Times New Roman" w:cs="Times New Roman"/>
-          <w:sz w:val="28"/>
-          <w:szCs w:val="28"/>
-        </w:rPr>
-        <w:t xml:space="preserve"> Phiếu giao hàng số {{deliveryNote}}</w:t>
-      </w:r>
-      <w:r>
-        <w:rPr>
-          <w:rFonts w:ascii="Times New Roman" w:hAnsi="Times New Roman" w:cs="Times New Roman"/>
-          <w:sz w:val="26"/>
-          <w:szCs w:val="26"/>
-        </w:rPr>
         <w:t xml:space="preserve"> </w:t>
       </w:r>
       <w:r>
@@ -1196,17 +1350,7 @@
           <w:sz w:val="28"/>
           <w:szCs w:val="28"/>
         </w:rPr>
-        <w:t>ngày</w:t>
-      </w:r>
-      <w:r>
-        <w:rPr>
-          <w:rFonts w:ascii="Times New Roman" w:hAnsi="Times New Roman" w:cs="Times New Roman"/>
-          <w:b/>
-          <w:bCs/>
-          <w:sz w:val="28"/>
-          <w:szCs w:val="28"/>
-        </w:rPr>
-        <w:t xml:space="preserve"> … / … / …;</w:t>
+        <w:t>……;</w:t>
       </w:r>
     </w:p>
     <w:p>
@@ -1234,7 +1378,23 @@
           <w:sz w:val="28"/>
           <w:szCs w:val="28"/>
         </w:rPr>
-        <w:t>Biên bản nghiệm thu vật tư, thiết bị trước khi đưa vào sử dụng ngày … / … / …(không);</w:t>
+        <w:t>Biên bản nghiệm thu vật tư, thiết bị trước khi đưa vào sử dụng ngày …</w:t>
+      </w:r>
+      <w:r>
+        <w:rPr>
+          <w:rFonts w:ascii="Times New Roman" w:hAnsi="Times New Roman" w:cs="Times New Roman"/>
+          <w:sz w:val="28"/>
+          <w:szCs w:val="28"/>
+        </w:rPr>
+        <w:t xml:space="preserve">… </w:t>
+      </w:r>
+      <w:r>
+        <w:rPr>
+          <w:rFonts w:ascii="Times New Roman" w:hAnsi="Times New Roman" w:cs="Times New Roman"/>
+          <w:sz w:val="28"/>
+          <w:szCs w:val="28"/>
+        </w:rPr>
+        <w:t>(không);</w:t>
       </w:r>
     </w:p>
     <w:p>
@@ -4281,7 +4441,25 @@
                 <w:sz w:val="22"/>
                 <w:szCs w:val="22"/>
               </w:rPr>
-              <w:t>{{#items}}{{stt}}</w:t>
+              <w:t>{{#items</w:t>
+            </w:r>
+            <w:proofErr w:type="gramStart"/>
+            <w:r>
+              <w:rPr>
+                <w:rFonts w:ascii="Times New Roman" w:hAnsi="Times New Roman" w:cs="Times New Roman"/>
+                <w:sz w:val="22"/>
+                <w:szCs w:val="22"/>
+              </w:rPr>
+              <w:t>}}{</w:t>
+            </w:r>
+            <w:proofErr w:type="gramEnd"/>
+            <w:r>
+              <w:rPr>
+                <w:rFonts w:ascii="Times New Roman" w:hAnsi="Times New Roman" w:cs="Times New Roman"/>
+                <w:sz w:val="22"/>
+                <w:szCs w:val="22"/>
+              </w:rPr>
+              <w:t>{stt}}</w:t>
             </w:r>
           </w:p>
         </w:tc>

</xml_diff>

<commit_message>
chore(bbnt-do): cập nhật 3 mẫu Word BBNT D-Office theo bản người dùng soạn lại
Mẫu mới tự gắn sẵn {{proposalDate}} và đã bỏ ô "ngày ……" lặp sau số biên bản
kiểm tra, nên hai bản vá tương ứng lúc chạy tự bỏ qua. Đã render thử cả 3 mẫu
(có/không có ngày) — không sót thẻ, dòng căn cứ và dòng BBKT in đúng.

Co-Authored-By: Claude Opus 5 <noreply@anthropic.com>
</commit_message>
<xml_diff>
--- a/templates/bbnt-do-template-bi.docx
+++ b/templates/bbnt-do-template-bi.docx
@@ -370,33 +370,15 @@
           <w:sz w:val="28"/>
           <w:szCs w:val="28"/>
         </w:rPr>
-        <w:t>{{pctNumber</w:t>
-      </w:r>
-      <w:proofErr w:type="gramStart"/>
-      <w:r>
-        <w:rPr>
-          <w:rFonts w:ascii="Times New Roman" w:hAnsi="Times New Roman" w:cs="Times New Roman"/>
-          <w:sz w:val="28"/>
-          <w:szCs w:val="28"/>
-        </w:rPr>
-        <w:t>}}</w:t>
-      </w:r>
-      <w:r>
-        <w:rPr>
-          <w:rFonts w:ascii="Times New Roman" w:hAnsi="Times New Roman" w:cs="Times New Roman"/>
-          <w:sz w:val="28"/>
-          <w:szCs w:val="28"/>
-        </w:rPr>
-        <w:t>{</w:t>
-      </w:r>
-      <w:proofErr w:type="gramEnd"/>
-      <w:r>
-        <w:rPr>
-          <w:rFonts w:ascii="Times New Roman" w:hAnsi="Times New Roman" w:cs="Times New Roman"/>
-          <w:sz w:val="28"/>
-          <w:szCs w:val="28"/>
-        </w:rPr>
-        <w:t>{pctContent}}</w:t>
+        <w:t>{{pctNumber}}</w:t>
+      </w:r>
+      <w:r>
+        <w:rPr>
+          <w:rFonts w:ascii="Times New Roman" w:hAnsi="Times New Roman" w:cs="Times New Roman"/>
+          <w:sz w:val="28"/>
+          <w:szCs w:val="28"/>
+        </w:rPr>
+        <w:t>{{pctContent}}</w:t>
       </w:r>
     </w:p>
     <w:p>
@@ -459,7 +441,6 @@
         </w:rPr>
         <w:t xml:space="preserve">Đại diện phòng Kỹ thuật và </w:t>
       </w:r>
-      <w:proofErr w:type="gramStart"/>
       <w:r>
         <w:rPr>
           <w:rFonts w:ascii="Times New Roman" w:hAnsi="Times New Roman" w:cs="Times New Roman"/>
@@ -478,18 +459,7 @@
           <w:sz w:val="28"/>
           <w:szCs w:val="28"/>
         </w:rPr>
-        <w:t>n</w:t>
-      </w:r>
-      <w:proofErr w:type="gramEnd"/>
-      <w:r>
-        <w:rPr>
-          <w:rFonts w:ascii="Times New Roman" w:hAnsi="Times New Roman" w:cs="Times New Roman"/>
-          <w:b/>
-          <w:iCs/>
-          <w:sz w:val="28"/>
-          <w:szCs w:val="28"/>
-        </w:rPr>
-        <w:t xml:space="preserve"> toàn</w:t>
+        <w:t>n toàn</w:t>
       </w:r>
     </w:p>
     <w:p>
@@ -1090,23 +1060,15 @@
           <w:sz w:val="28"/>
           <w:szCs w:val="28"/>
         </w:rPr>
-        <w:t xml:space="preserve"> ngà</w:t>
-      </w:r>
-      <w:r>
-        <w:rPr>
-          <w:rFonts w:ascii="Times New Roman" w:hAnsi="Times New Roman" w:cs="Times New Roman"/>
-          <w:sz w:val="28"/>
-          <w:szCs w:val="28"/>
-        </w:rPr>
-        <w:t>y: ….</w:t>
-      </w:r>
-      <w:r>
-        <w:rPr>
-          <w:rFonts w:ascii="Times New Roman" w:hAnsi="Times New Roman" w:cs="Times New Roman"/>
-          <w:sz w:val="28"/>
-          <w:szCs w:val="28"/>
-        </w:rPr>
-        <w:t>; (không)</w:t>
+        <w:t>;</w:t>
+      </w:r>
+      <w:r>
+        <w:rPr>
+          <w:rFonts w:ascii="Times New Roman" w:hAnsi="Times New Roman" w:cs="Times New Roman"/>
+          <w:sz w:val="28"/>
+          <w:szCs w:val="28"/>
+        </w:rPr>
+        <w:t>(không)</w:t>
       </w:r>
     </w:p>
     <w:p>
@@ -1170,18 +1132,8 @@
           <w:sz w:val="28"/>
           <w:szCs w:val="28"/>
         </w:rPr>
-        <w:t xml:space="preserve">ố: </w:t>
-      </w:r>
-      <w:proofErr w:type="gramStart"/>
-      <w:r>
-        <w:rPr>
-          <w:rFonts w:ascii="Times New Roman" w:hAnsi="Times New Roman" w:cs="Times New Roman"/>
-          <w:sz w:val="28"/>
-          <w:szCs w:val="28"/>
-        </w:rPr>
-        <w:t>…..</w:t>
-      </w:r>
-      <w:proofErr w:type="gramEnd"/>
+        <w:t>ố: …..</w:t>
+      </w:r>
       <w:r>
         <w:rPr>
           <w:rFonts w:ascii="Times New Roman" w:hAnsi="Times New Roman" w:cs="Times New Roman"/>
@@ -1220,25 +1172,7 @@
           <w:sz w:val="28"/>
           <w:szCs w:val="28"/>
         </w:rPr>
-        <w:t xml:space="preserve"> của Phòng Kỹ thuật và </w:t>
-      </w:r>
-      <w:proofErr w:type="gramStart"/>
-      <w:r>
-        <w:rPr>
-          <w:rFonts w:ascii="Times New Roman" w:hAnsi="Times New Roman" w:cs="Times New Roman"/>
-          <w:sz w:val="28"/>
-          <w:szCs w:val="28"/>
-        </w:rPr>
-        <w:t>An</w:t>
-      </w:r>
-      <w:proofErr w:type="gramEnd"/>
-      <w:r>
-        <w:rPr>
-          <w:rFonts w:ascii="Times New Roman" w:hAnsi="Times New Roman" w:cs="Times New Roman"/>
-          <w:sz w:val="28"/>
-          <w:szCs w:val="28"/>
-        </w:rPr>
-        <w:t xml:space="preserve"> toàn về việc …</w:t>
+        <w:t xml:space="preserve"> của Phòng Kỹ thuật và An toàn về việc …</w:t>
       </w:r>
       <w:r>
         <w:rPr>
@@ -1308,7 +1242,23 @@
           <w:sz w:val="28"/>
           <w:szCs w:val="28"/>
         </w:rPr>
-        <w:t xml:space="preserve">……. </w:t>
+        <w:t>{{proposalDate}}</w:t>
+      </w:r>
+      <w:r>
+        <w:rPr>
+          <w:rFonts w:ascii="Times New Roman" w:hAnsi="Times New Roman" w:cs="Times New Roman"/>
+          <w:sz w:val="28"/>
+          <w:szCs w:val="28"/>
+        </w:rPr>
+        <w:t xml:space="preserve">. </w:t>
+      </w:r>
+      <w:r>
+        <w:rPr>
+          <w:rFonts w:ascii="Times New Roman" w:hAnsi="Times New Roman" w:cs="Times New Roman"/>
+          <w:sz w:val="28"/>
+          <w:szCs w:val="28"/>
+        </w:rPr>
+        <w:t xml:space="preserve"> </w:t>
       </w:r>
       <w:r>
         <w:rPr>
@@ -4441,25 +4391,7 @@
                 <w:sz w:val="22"/>
                 <w:szCs w:val="22"/>
               </w:rPr>
-              <w:t>{{#items</w:t>
-            </w:r>
-            <w:proofErr w:type="gramStart"/>
-            <w:r>
-              <w:rPr>
-                <w:rFonts w:ascii="Times New Roman" w:hAnsi="Times New Roman" w:cs="Times New Roman"/>
-                <w:sz w:val="22"/>
-                <w:szCs w:val="22"/>
-              </w:rPr>
-              <w:t>}}{</w:t>
-            </w:r>
-            <w:proofErr w:type="gramEnd"/>
-            <w:r>
-              <w:rPr>
-                <w:rFonts w:ascii="Times New Roman" w:hAnsi="Times New Roman" w:cs="Times New Roman"/>
-                <w:sz w:val="22"/>
-                <w:szCs w:val="22"/>
-              </w:rPr>
-              <w:t>{stt}}</w:t>
+              <w:t>{{#items}}{{stt}}</w:t>
             </w:r>
           </w:p>
         </w:tc>

</xml_diff>